<commit_message>
Let students choose a final company, list the other forms under Before OJT with the MoA first, and fix the form details
A student accepted by several companies picks one final company (one click, only an accepted company, one at a time),
and the roadmap, student page and Tracker show it. Migration 14 adds that flag and opens the Letter of Acceptance,
Mentorship Plan, Training Agreement and Waiver and (optional) Endorsement letter as tasks under Before OJT, MoA first,
each with its Word template. The coordinator name is back to Balmadrid and the Training Agreement is worded for BSIT.

Co-Authored-By: Claude Sonnet 5.5 <noreply@anthropic.com>
</commit_message>
<xml_diff>
--- a/public/files/Training-Agreement-and-Waiver.docx
+++ b/public/files/Training-Agreement-and-Waiver.docx
@@ -134,9 +134,8 @@
         <w:rPr>
           <w:rFonts w:ascii="Times New Roman" w:eastAsia="Times New Roman" w:hAnsi="Times New Roman" w:cs="Times New Roman"/>
           <w:b/>
-          <w:highlight w:val="yellow"/>
-        </w:rPr>
-        <w:t xml:space="preserve">                            </w:t>
+        </w:rPr>
+        <w:t xml:space="preserve">Information Technology</w:t>
       </w:r>
       <w:r>
         <w:rPr>
@@ -407,7 +406,7 @@
         <w:rPr>
           <w:rFonts w:ascii="Times New Roman" w:eastAsia="Times New Roman" w:hAnsi="Times New Roman" w:cs="Times New Roman"/>
         </w:rPr>
-        <w:t>5</w:t>
+        <w:t xml:space="preserve">_</w:t>
       </w:r>
       <w:r>
         <w:rPr>

</xml_diff>